<commit_message>
add work on weight-at-size draft tech report
</commit_message>
<xml_diff>
--- a/lw-techreport-EN/tech-report-cover.docx
+++ b/lw-techreport-EN/tech-report-cover.docx
@@ -1,6 +1,6 @@
 
 <file path=word/document.xml><?xml version="1.0" encoding="utf-8"?>
-<w:document xmlns:wpc="http://schemas.microsoft.com/office/word/2010/wordprocessingCanvas" xmlns:cx="http://schemas.microsoft.com/office/drawing/2014/chartex" xmlns:cx1="http://schemas.microsoft.com/office/drawing/2015/9/8/chartex" xmlns:cx2="http://schemas.microsoft.com/office/drawing/2015/10/21/chartex" xmlns:cx3="http://schemas.microsoft.com/office/drawing/2016/5/9/chartex" xmlns:cx4="http://schemas.microsoft.com/office/drawing/2016/5/10/chartex" xmlns:cx5="http://schemas.microsoft.com/office/drawing/2016/5/11/chartex" xmlns:cx6="http://schemas.microsoft.com/office/drawing/2016/5/12/chartex" xmlns:cx7="http://schemas.microsoft.com/office/drawing/2016/5/13/chartex" xmlns:cx8="http://schemas.microsoft.com/office/drawing/2016/5/14/chartex" xmlns:mc="http://schemas.openxmlformats.org/markup-compatibility/2006" xmlns:aink="http://schemas.microsoft.com/office/drawing/2016/ink" xmlns:am3d="http://schemas.microsoft.com/office/drawing/2017/model3d" xmlns:o="urn:schemas-microsoft-com:office:office" xmlns:oel="http://schemas.microsoft.com/office/2019/extlst" xmlns:r="http://schemas.openxmlformats.org/officeDocument/2006/relationships" xmlns:m="http://schemas.openxmlformats.org/officeDocument/2006/math" xmlns:v="urn:schemas-microsoft-com:vml" xmlns:wp14="http://schemas.microsoft.com/office/word/2010/wordprocessingDrawing" xmlns:wp="http://schemas.openxmlformats.org/drawingml/2006/wordprocessingDrawing" xmlns:w10="urn:schemas-microsoft-com:office:word" xmlns:w="http://schemas.openxmlformats.org/wordprocessingml/2006/main" xmlns:w14="http://schemas.microsoft.com/office/word/2010/wordml" xmlns:w15="http://schemas.microsoft.com/office/word/2012/wordml" xmlns:w16cex="http://schemas.microsoft.com/office/word/2018/wordml/cex" xmlns:w16cid="http://schemas.microsoft.com/office/word/2016/wordml/cid" xmlns:w16="http://schemas.microsoft.com/office/word/2018/wordml" xmlns:w16sdtdh="http://schemas.microsoft.com/office/word/2020/wordml/sdtdatahash" xmlns:w16se="http://schemas.microsoft.com/office/word/2015/wordml/symex" xmlns:wpg="http://schemas.microsoft.com/office/word/2010/wordprocessingGroup" xmlns:wpi="http://schemas.microsoft.com/office/word/2010/wordprocessingInk" xmlns:wne="http://schemas.microsoft.com/office/word/2006/wordml" xmlns:wps="http://schemas.microsoft.com/office/word/2010/wordprocessingShape" mc:Ignorable="w14 w15 w16se w16cid w16 w16cex w16sdtdh wp14">
+<w:document xmlns:wpc="http://schemas.microsoft.com/office/word/2010/wordprocessingCanvas" xmlns:cx="http://schemas.microsoft.com/office/drawing/2014/chartex" xmlns:cx1="http://schemas.microsoft.com/office/drawing/2015/9/8/chartex" xmlns:cx2="http://schemas.microsoft.com/office/drawing/2015/10/21/chartex" xmlns:cx3="http://schemas.microsoft.com/office/drawing/2016/5/9/chartex" xmlns:cx4="http://schemas.microsoft.com/office/drawing/2016/5/10/chartex" xmlns:cx5="http://schemas.microsoft.com/office/drawing/2016/5/11/chartex" xmlns:cx6="http://schemas.microsoft.com/office/drawing/2016/5/12/chartex" xmlns:cx7="http://schemas.microsoft.com/office/drawing/2016/5/13/chartex" xmlns:cx8="http://schemas.microsoft.com/office/drawing/2016/5/14/chartex" xmlns:mc="http://schemas.openxmlformats.org/markup-compatibility/2006" xmlns:aink="http://schemas.microsoft.com/office/drawing/2016/ink" xmlns:am3d="http://schemas.microsoft.com/office/drawing/2017/model3d" xmlns:o="urn:schemas-microsoft-com:office:office" xmlns:oel="http://schemas.microsoft.com/office/2019/extlst" xmlns:r="http://schemas.openxmlformats.org/officeDocument/2006/relationships" xmlns:m="http://schemas.openxmlformats.org/officeDocument/2006/math" xmlns:v="urn:schemas-microsoft-com:vml" xmlns:wp14="http://schemas.microsoft.com/office/word/2010/wordprocessingDrawing" xmlns:wp="http://schemas.openxmlformats.org/drawingml/2006/wordprocessingDrawing" xmlns:w10="urn:schemas-microsoft-com:office:word" xmlns:w="http://schemas.openxmlformats.org/wordprocessingml/2006/main" xmlns:w14="http://schemas.microsoft.com/office/word/2010/wordml" xmlns:w15="http://schemas.microsoft.com/office/word/2012/wordml" xmlns:w16cex="http://schemas.microsoft.com/office/word/2018/wordml/cex" xmlns:w16cid="http://schemas.microsoft.com/office/word/2016/wordml/cid" xmlns:w16="http://schemas.microsoft.com/office/word/2018/wordml" xmlns:w16du="http://schemas.microsoft.com/office/word/2023/wordml/word16du" xmlns:w16sdtdh="http://schemas.microsoft.com/office/word/2020/wordml/sdtdatahash" xmlns:w16sdtfl="http://schemas.microsoft.com/office/word/2024/wordml/sdtformatlock" xmlns:w16se="http://schemas.microsoft.com/office/word/2015/wordml/symex" xmlns:wpg="http://schemas.microsoft.com/office/word/2010/wordprocessingGroup" xmlns:wpi="http://schemas.microsoft.com/office/word/2010/wordprocessingInk" xmlns:wne="http://schemas.microsoft.com/office/word/2006/wordml" xmlns:wps="http://schemas.microsoft.com/office/word/2010/wordprocessingShape" mc:Ignorable="w14 w15 w16se w16cid w16 w16cex w16sdtdh w16sdtfl w16du wp14">
   <w:body>
     <w:tbl>
       <w:tblPr>
@@ -98,16 +98,16 @@
                 <w:sz w:val="36"/>
                 <w:szCs w:val="36"/>
               </w:rPr>
-              <w:t xml:space="preserve">A </w:t>
-            </w:r>
-            <w:r>
-              <w:rPr>
-                <w:rFonts w:ascii="Microsoft Sans Serif" w:hAnsi="Microsoft Sans Serif" w:cs="Microsoft Sans Serif"/>
-                <w:b/>
-                <w:sz w:val="36"/>
-                <w:szCs w:val="36"/>
-              </w:rPr>
-              <w:t>mixed-effects</w:t>
+              <w:t>M</w:t>
+            </w:r>
+            <w:r>
+              <w:rPr>
+                <w:rFonts w:ascii="Microsoft Sans Serif" w:hAnsi="Microsoft Sans Serif" w:cs="Microsoft Sans Serif"/>
+                <w:b/>
+                <w:sz w:val="36"/>
+                <w:szCs w:val="36"/>
+              </w:rPr>
+              <w:t>ixed-effects</w:t>
             </w:r>
             <w:r>
               <w:rPr>
@@ -125,7 +125,34 @@
                 <w:sz w:val="36"/>
                 <w:szCs w:val="36"/>
               </w:rPr>
-              <w:t xml:space="preserve">approach to estimating length-weight relationship parameters </w:t>
+              <w:t xml:space="preserve">modelling of the </w:t>
+            </w:r>
+            <w:r>
+              <w:rPr>
+                <w:rFonts w:ascii="Microsoft Sans Serif" w:hAnsi="Microsoft Sans Serif" w:cs="Microsoft Sans Serif"/>
+                <w:b/>
+                <w:sz w:val="36"/>
+                <w:szCs w:val="36"/>
+              </w:rPr>
+              <w:t>weight</w:t>
+            </w:r>
+            <w:r>
+              <w:rPr>
+                <w:rFonts w:ascii="Microsoft Sans Serif" w:hAnsi="Microsoft Sans Serif" w:cs="Microsoft Sans Serif"/>
+                <w:b/>
+                <w:sz w:val="36"/>
+                <w:szCs w:val="36"/>
+              </w:rPr>
+              <w:t>-at-size</w:t>
+            </w:r>
+            <w:r>
+              <w:rPr>
+                <w:rFonts w:ascii="Microsoft Sans Serif" w:hAnsi="Microsoft Sans Serif" w:cs="Microsoft Sans Serif"/>
+                <w:b/>
+                <w:sz w:val="36"/>
+                <w:szCs w:val="36"/>
+              </w:rPr>
+              <w:t xml:space="preserve"> relationship </w:t>
             </w:r>
             <w:r>
               <w:rPr>
@@ -170,34 +197,34 @@
                 <w:sz w:val="36"/>
                 <w:szCs w:val="36"/>
               </w:rPr>
-              <w:t xml:space="preserve"> the annual southern Gulf of St. Lawrence </w:t>
-            </w:r>
-            <w:r>
-              <w:rPr>
-                <w:rFonts w:ascii="Microsoft Sans Serif" w:hAnsi="Microsoft Sans Serif" w:cs="Microsoft Sans Serif"/>
-                <w:b/>
-                <w:sz w:val="36"/>
-                <w:szCs w:val="36"/>
-              </w:rPr>
-              <w:t>ecosystem September</w:t>
-            </w:r>
-            <w:r>
-              <w:rPr>
-                <w:rFonts w:ascii="Microsoft Sans Serif" w:hAnsi="Microsoft Sans Serif" w:cs="Microsoft Sans Serif"/>
-                <w:b/>
-                <w:sz w:val="36"/>
-                <w:szCs w:val="36"/>
-              </w:rPr>
-              <w:t xml:space="preserve"> survey (1971-202</w:t>
-            </w:r>
-            <w:r>
-              <w:rPr>
-                <w:rFonts w:ascii="Microsoft Sans Serif" w:hAnsi="Microsoft Sans Serif" w:cs="Microsoft Sans Serif"/>
-                <w:b/>
-                <w:sz w:val="36"/>
-                <w:szCs w:val="36"/>
-              </w:rPr>
-              <w:t>3</w:t>
+              <w:t xml:space="preserve"> the annual </w:t>
+            </w:r>
+            <w:r>
+              <w:rPr>
+                <w:rFonts w:ascii="Microsoft Sans Serif" w:hAnsi="Microsoft Sans Serif" w:cs="Microsoft Sans Serif"/>
+                <w:b/>
+                <w:sz w:val="36"/>
+                <w:szCs w:val="36"/>
+              </w:rPr>
+              <w:t xml:space="preserve">September ecosystem survey of the </w:t>
+            </w:r>
+            <w:r>
+              <w:rPr>
+                <w:rFonts w:ascii="Microsoft Sans Serif" w:hAnsi="Microsoft Sans Serif" w:cs="Microsoft Sans Serif"/>
+                <w:b/>
+                <w:sz w:val="36"/>
+                <w:szCs w:val="36"/>
+              </w:rPr>
+              <w:t>southern Gulf of St. Lawrence (1971-202</w:t>
+            </w:r>
+            <w:r>
+              <w:rPr>
+                <w:rFonts w:ascii="Microsoft Sans Serif" w:hAnsi="Microsoft Sans Serif" w:cs="Microsoft Sans Serif"/>
+                <w:b/>
+                <w:sz w:val="36"/>
+                <w:szCs w:val="36"/>
+              </w:rPr>
+              <w:t>5</w:t>
             </w:r>
             <w:r>
               <w:rPr>
@@ -301,6 +328,15 @@
                 <w:sz w:val="28"/>
                 <w:szCs w:val="28"/>
               </w:rPr>
+              <w:t>, Matthew Robertson,</w:t>
+            </w:r>
+            <w:r>
+              <w:rPr>
+                <w:rFonts w:ascii="Microsoft Sans Serif" w:hAnsi="Microsoft Sans Serif" w:cs="Microsoft Sans Serif"/>
+                <w:noProof/>
+                <w:sz w:val="28"/>
+                <w:szCs w:val="28"/>
+              </w:rPr>
               <w:t xml:space="preserve"> and</w:t>
             </w:r>
             <w:r>
@@ -548,7 +584,7 @@
                 <w:szCs w:val="28"/>
                 <w:lang w:val="fr-CA"/>
               </w:rPr>
-              <w:t>4</w:t>
+              <w:t>6</w:t>
             </w:r>
             <w:r>
               <w:rPr>
@@ -685,8 +721,9 @@
           <w:szCs w:val="40"/>
         </w:rPr>
         <w:sectPr>
-          <w:headerReference w:type="default" r:id="rId7"/>
+          <w:headerReference w:type="even" r:id="rId7"/>
           <w:footerReference w:type="default" r:id="rId8"/>
+          <w:headerReference w:type="first" r:id="rId9"/>
           <w:type w:val="continuous"/>
           <w:pgSz w:w="12240" w:h="15840" w:code="1"/>
           <w:pgMar w:top="1440" w:right="1440" w:bottom="562" w:left="1440" w:header="720" w:footer="720" w:gutter="0"/>
@@ -717,7 +754,7 @@
 </file>
 
 <file path=word/endnotes.xml><?xml version="1.0" encoding="utf-8"?>
-<w:endnotes xmlns:wpc="http://schemas.microsoft.com/office/word/2010/wordprocessingCanvas" xmlns:cx="http://schemas.microsoft.com/office/drawing/2014/chartex" xmlns:cx1="http://schemas.microsoft.com/office/drawing/2015/9/8/chartex" xmlns:cx2="http://schemas.microsoft.com/office/drawing/2015/10/21/chartex" xmlns:cx3="http://schemas.microsoft.com/office/drawing/2016/5/9/chartex" xmlns:cx4="http://schemas.microsoft.com/office/drawing/2016/5/10/chartex" xmlns:cx5="http://schemas.microsoft.com/office/drawing/2016/5/11/chartex" xmlns:cx6="http://schemas.microsoft.com/office/drawing/2016/5/12/chartex" xmlns:cx7="http://schemas.microsoft.com/office/drawing/2016/5/13/chartex" xmlns:cx8="http://schemas.microsoft.com/office/drawing/2016/5/14/chartex" xmlns:mc="http://schemas.openxmlformats.org/markup-compatibility/2006" xmlns:aink="http://schemas.microsoft.com/office/drawing/2016/ink" xmlns:am3d="http://schemas.microsoft.com/office/drawing/2017/model3d" xmlns:o="urn:schemas-microsoft-com:office:office" xmlns:oel="http://schemas.microsoft.com/office/2019/extlst" xmlns:r="http://schemas.openxmlformats.org/officeDocument/2006/relationships" xmlns:m="http://schemas.openxmlformats.org/officeDocument/2006/math" xmlns:v="urn:schemas-microsoft-com:vml" xmlns:wp14="http://schemas.microsoft.com/office/word/2010/wordprocessingDrawing" xmlns:wp="http://schemas.openxmlformats.org/drawingml/2006/wordprocessingDrawing" xmlns:w10="urn:schemas-microsoft-com:office:word" xmlns:w="http://schemas.openxmlformats.org/wordprocessingml/2006/main" xmlns:w14="http://schemas.microsoft.com/office/word/2010/wordml" xmlns:w15="http://schemas.microsoft.com/office/word/2012/wordml" xmlns:w16cex="http://schemas.microsoft.com/office/word/2018/wordml/cex" xmlns:w16cid="http://schemas.microsoft.com/office/word/2016/wordml/cid" xmlns:w16="http://schemas.microsoft.com/office/word/2018/wordml" xmlns:w16sdtdh="http://schemas.microsoft.com/office/word/2020/wordml/sdtdatahash" xmlns:w16se="http://schemas.microsoft.com/office/word/2015/wordml/symex" xmlns:wpg="http://schemas.microsoft.com/office/word/2010/wordprocessingGroup" xmlns:wpi="http://schemas.microsoft.com/office/word/2010/wordprocessingInk" xmlns:wne="http://schemas.microsoft.com/office/word/2006/wordml" xmlns:wps="http://schemas.microsoft.com/office/word/2010/wordprocessingShape" mc:Ignorable="w14 w15 w16se w16cid w16 w16cex w16sdtdh wp14">
+<w:endnotes xmlns:wpc="http://schemas.microsoft.com/office/word/2010/wordprocessingCanvas" xmlns:cx="http://schemas.microsoft.com/office/drawing/2014/chartex" xmlns:cx1="http://schemas.microsoft.com/office/drawing/2015/9/8/chartex" xmlns:cx2="http://schemas.microsoft.com/office/drawing/2015/10/21/chartex" xmlns:cx3="http://schemas.microsoft.com/office/drawing/2016/5/9/chartex" xmlns:cx4="http://schemas.microsoft.com/office/drawing/2016/5/10/chartex" xmlns:cx5="http://schemas.microsoft.com/office/drawing/2016/5/11/chartex" xmlns:cx6="http://schemas.microsoft.com/office/drawing/2016/5/12/chartex" xmlns:cx7="http://schemas.microsoft.com/office/drawing/2016/5/13/chartex" xmlns:cx8="http://schemas.microsoft.com/office/drawing/2016/5/14/chartex" xmlns:mc="http://schemas.openxmlformats.org/markup-compatibility/2006" xmlns:aink="http://schemas.microsoft.com/office/drawing/2016/ink" xmlns:am3d="http://schemas.microsoft.com/office/drawing/2017/model3d" xmlns:o="urn:schemas-microsoft-com:office:office" xmlns:oel="http://schemas.microsoft.com/office/2019/extlst" xmlns:r="http://schemas.openxmlformats.org/officeDocument/2006/relationships" xmlns:m="http://schemas.openxmlformats.org/officeDocument/2006/math" xmlns:v="urn:schemas-microsoft-com:vml" xmlns:wp14="http://schemas.microsoft.com/office/word/2010/wordprocessingDrawing" xmlns:wp="http://schemas.openxmlformats.org/drawingml/2006/wordprocessingDrawing" xmlns:w10="urn:schemas-microsoft-com:office:word" xmlns:w="http://schemas.openxmlformats.org/wordprocessingml/2006/main" xmlns:w14="http://schemas.microsoft.com/office/word/2010/wordml" xmlns:w15="http://schemas.microsoft.com/office/word/2012/wordml" xmlns:w16cex="http://schemas.microsoft.com/office/word/2018/wordml/cex" xmlns:w16cid="http://schemas.microsoft.com/office/word/2016/wordml/cid" xmlns:w16="http://schemas.microsoft.com/office/word/2018/wordml" xmlns:w16du="http://schemas.microsoft.com/office/word/2023/wordml/word16du" xmlns:w16sdtdh="http://schemas.microsoft.com/office/word/2020/wordml/sdtdatahash" xmlns:w16sdtfl="http://schemas.microsoft.com/office/word/2024/wordml/sdtformatlock" xmlns:w16se="http://schemas.microsoft.com/office/word/2015/wordml/symex" xmlns:wpg="http://schemas.microsoft.com/office/word/2010/wordprocessingGroup" xmlns:wpi="http://schemas.microsoft.com/office/word/2010/wordprocessingInk" xmlns:wne="http://schemas.microsoft.com/office/word/2006/wordml" xmlns:wps="http://schemas.microsoft.com/office/word/2010/wordprocessingShape" mc:Ignorable="w14 w15 w16se w16cid w16 w16cex w16sdtdh w16sdtfl w16du wp14">
   <w:endnote w:type="separator" w:id="-1">
     <w:p>
       <w:r>
@@ -736,7 +773,7 @@
 </file>
 
 <file path=word/footer1.xml><?xml version="1.0" encoding="utf-8"?>
-<w:ftr xmlns:wpc="http://schemas.microsoft.com/office/word/2010/wordprocessingCanvas" xmlns:cx="http://schemas.microsoft.com/office/drawing/2014/chartex" xmlns:cx1="http://schemas.microsoft.com/office/drawing/2015/9/8/chartex" xmlns:cx2="http://schemas.microsoft.com/office/drawing/2015/10/21/chartex" xmlns:cx3="http://schemas.microsoft.com/office/drawing/2016/5/9/chartex" xmlns:cx4="http://schemas.microsoft.com/office/drawing/2016/5/10/chartex" xmlns:cx5="http://schemas.microsoft.com/office/drawing/2016/5/11/chartex" xmlns:cx6="http://schemas.microsoft.com/office/drawing/2016/5/12/chartex" xmlns:cx7="http://schemas.microsoft.com/office/drawing/2016/5/13/chartex" xmlns:cx8="http://schemas.microsoft.com/office/drawing/2016/5/14/chartex" xmlns:mc="http://schemas.openxmlformats.org/markup-compatibility/2006" xmlns:aink="http://schemas.microsoft.com/office/drawing/2016/ink" xmlns:am3d="http://schemas.microsoft.com/office/drawing/2017/model3d" xmlns:o="urn:schemas-microsoft-com:office:office" xmlns:oel="http://schemas.microsoft.com/office/2019/extlst" xmlns:r="http://schemas.openxmlformats.org/officeDocument/2006/relationships" xmlns:m="http://schemas.openxmlformats.org/officeDocument/2006/math" xmlns:v="urn:schemas-microsoft-com:vml" xmlns:wp14="http://schemas.microsoft.com/office/word/2010/wordprocessingDrawing" xmlns:wp="http://schemas.openxmlformats.org/drawingml/2006/wordprocessingDrawing" xmlns:w10="urn:schemas-microsoft-com:office:word" xmlns:w="http://schemas.openxmlformats.org/wordprocessingml/2006/main" xmlns:w14="http://schemas.microsoft.com/office/word/2010/wordml" xmlns:w15="http://schemas.microsoft.com/office/word/2012/wordml" xmlns:w16cex="http://schemas.microsoft.com/office/word/2018/wordml/cex" xmlns:w16cid="http://schemas.microsoft.com/office/word/2016/wordml/cid" xmlns:w16="http://schemas.microsoft.com/office/word/2018/wordml" xmlns:w16sdtdh="http://schemas.microsoft.com/office/word/2020/wordml/sdtdatahash" xmlns:w16se="http://schemas.microsoft.com/office/word/2015/wordml/symex" xmlns:wpg="http://schemas.microsoft.com/office/word/2010/wordprocessingGroup" xmlns:wpi="http://schemas.microsoft.com/office/word/2010/wordprocessingInk" xmlns:wne="http://schemas.microsoft.com/office/word/2006/wordml" xmlns:wps="http://schemas.microsoft.com/office/word/2010/wordprocessingShape" mc:Ignorable="w14 w15 w16se w16cid w16 w16cex w16sdtdh wp14">
+<w:ftr xmlns:wpc="http://schemas.microsoft.com/office/word/2010/wordprocessingCanvas" xmlns:cx="http://schemas.microsoft.com/office/drawing/2014/chartex" xmlns:cx1="http://schemas.microsoft.com/office/drawing/2015/9/8/chartex" xmlns:cx2="http://schemas.microsoft.com/office/drawing/2015/10/21/chartex" xmlns:cx3="http://schemas.microsoft.com/office/drawing/2016/5/9/chartex" xmlns:cx4="http://schemas.microsoft.com/office/drawing/2016/5/10/chartex" xmlns:cx5="http://schemas.microsoft.com/office/drawing/2016/5/11/chartex" xmlns:cx6="http://schemas.microsoft.com/office/drawing/2016/5/12/chartex" xmlns:cx7="http://schemas.microsoft.com/office/drawing/2016/5/13/chartex" xmlns:cx8="http://schemas.microsoft.com/office/drawing/2016/5/14/chartex" xmlns:mc="http://schemas.openxmlformats.org/markup-compatibility/2006" xmlns:aink="http://schemas.microsoft.com/office/drawing/2016/ink" xmlns:am3d="http://schemas.microsoft.com/office/drawing/2017/model3d" xmlns:o="urn:schemas-microsoft-com:office:office" xmlns:oel="http://schemas.microsoft.com/office/2019/extlst" xmlns:r="http://schemas.openxmlformats.org/officeDocument/2006/relationships" xmlns:m="http://schemas.openxmlformats.org/officeDocument/2006/math" xmlns:v="urn:schemas-microsoft-com:vml" xmlns:wp14="http://schemas.microsoft.com/office/word/2010/wordprocessingDrawing" xmlns:wp="http://schemas.openxmlformats.org/drawingml/2006/wordprocessingDrawing" xmlns:w10="urn:schemas-microsoft-com:office:word" xmlns:w="http://schemas.openxmlformats.org/wordprocessingml/2006/main" xmlns:w14="http://schemas.microsoft.com/office/word/2010/wordml" xmlns:w15="http://schemas.microsoft.com/office/word/2012/wordml" xmlns:w16cex="http://schemas.microsoft.com/office/word/2018/wordml/cex" xmlns:w16cid="http://schemas.microsoft.com/office/word/2016/wordml/cid" xmlns:w16="http://schemas.microsoft.com/office/word/2018/wordml" xmlns:w16du="http://schemas.microsoft.com/office/word/2023/wordml/word16du" xmlns:w16sdtdh="http://schemas.microsoft.com/office/word/2020/wordml/sdtdatahash" xmlns:w16sdtfl="http://schemas.microsoft.com/office/word/2024/wordml/sdtformatlock" xmlns:w16se="http://schemas.microsoft.com/office/word/2015/wordml/symex" xmlns:wpg="http://schemas.microsoft.com/office/word/2010/wordprocessingGroup" xmlns:wpi="http://schemas.microsoft.com/office/word/2010/wordprocessingInk" xmlns:wne="http://schemas.microsoft.com/office/word/2006/wordml" xmlns:wps="http://schemas.microsoft.com/office/word/2010/wordprocessingShape" mc:Ignorable="w14 w15 w16se w16cid w16 w16cex w16sdtdh w16sdtfl w16du wp14">
   <w:p>
     <w:pPr>
       <w:pStyle w:val="Footer"/>
@@ -880,7 +917,7 @@
               <v:stroke joinstyle="miter"/>
               <v:path gradientshapeok="t" o:connecttype="rect"/>
             </v:shapetype>
-            <v:shape id="Text Box 5" o:spid="_x0000_s1026" type="#_x0000_t202" style="position:absolute;left:0;text-align:left;margin-left:389.8pt;margin-top:-2.2pt;width:87.95pt;height:32.55pt;z-index:251658240;visibility:visible;mso-wrap-style:none;mso-width-percent:0;mso-height-percent:0;mso-wrap-distance-left:9pt;mso-wrap-distance-top:0;mso-wrap-distance-right:9pt;mso-wrap-distance-bottom:0;mso-position-horizontal:absolute;mso-position-horizontal-relative:text;mso-position-vertical:absolute;mso-position-vertical-relative:text;mso-width-percent:0;mso-height-percent:0;mso-width-relative:page;mso-height-relative:page;v-text-anchor:top" o:gfxdata="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" o:allowincell="f" stroked="f">
+            <v:shape id="Text Box 5" o:spid="_x0000_s1027" type="#_x0000_t202" style="position:absolute;left:0;text-align:left;margin-left:389.8pt;margin-top:-2.2pt;width:87.95pt;height:32.55pt;z-index:251658240;visibility:visible;mso-wrap-style:none;mso-width-percent:0;mso-height-percent:0;mso-wrap-distance-left:9pt;mso-wrap-distance-top:0;mso-wrap-distance-right:9pt;mso-wrap-distance-bottom:0;mso-position-horizontal:absolute;mso-position-horizontal-relative:text;mso-position-vertical:absolute;mso-position-vertical-relative:text;mso-width-percent:0;mso-height-percent:0;mso-width-relative:page;mso-height-relative:page;v-text-anchor:top" o:gfxdata="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" o:allowincell="f" stroked="f">
               <v:path arrowok="t"/>
               <v:textbox>
                 <w:txbxContent>
@@ -907,7 +944,7 @@
                                   </pic:cNvPicPr>
                                 </pic:nvPicPr>
                                 <pic:blipFill>
-                                  <a:blip r:embed="rId2">
+                                  <a:blip r:embed="rId1">
                                     <a:extLst>
                                       <a:ext uri="{28A0092B-C50C-407E-A947-70E740481C1C}">
                                         <a14:useLocalDpi xmlns:a14="http://schemas.microsoft.com/office/drawing/2010/main" val="0"/>
@@ -1026,7 +1063,7 @@
                                         </pic:cNvPicPr>
                                       </pic:nvPicPr>
                                       <pic:blipFill>
-                                        <a:blip r:embed="rId3">
+                                        <a:blip r:embed="rId2">
                                           <a:extLst>
                                             <a:ext uri="{28A0092B-C50C-407E-A947-70E740481C1C}">
                                               <a14:useLocalDpi xmlns:a14="http://schemas.microsoft.com/office/drawing/2010/main" val="0"/>
@@ -1077,7 +1114,7 @@
         </mc:Choice>
         <mc:Fallback>
           <w:pict>
-            <v:shape w14:anchorId="289C156D" id="Text Box 4" o:spid="_x0000_s1027" type="#_x0000_t202" style="position:absolute;left:0;text-align:left;margin-left:-9pt;margin-top:-2.2pt;width:238.1pt;height:46.3pt;z-index:251657216;visibility:visible;mso-wrap-style:square;mso-width-percent:0;mso-height-percent:0;mso-wrap-distance-left:9pt;mso-wrap-distance-top:0;mso-wrap-distance-right:9pt;mso-wrap-distance-bottom:0;mso-position-horizontal:absolute;mso-position-horizontal-relative:text;mso-position-vertical:absolute;mso-position-vertical-relative:text;mso-width-percent:0;mso-height-percent:0;mso-width-relative:page;mso-height-relative:page;v-text-anchor:top" o:gfxdata="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" stroked="f">
+            <v:shape w14:anchorId="289C156D" id="Text Box 4" o:spid="_x0000_s1028" type="#_x0000_t202" style="position:absolute;left:0;text-align:left;margin-left:-9pt;margin-top:-2.2pt;width:238.1pt;height:46.3pt;z-index:251657216;visibility:visible;mso-wrap-style:square;mso-width-percent:0;mso-height-percent:0;mso-wrap-distance-left:9pt;mso-wrap-distance-top:0;mso-wrap-distance-right:9pt;mso-wrap-distance-bottom:0;mso-position-horizontal:absolute;mso-position-horizontal-relative:text;mso-position-vertical:absolute;mso-position-vertical-relative:text;mso-width-percent:0;mso-height-percent:0;mso-width-relative:page;mso-height-relative:page;v-text-anchor:top" o:gfxdata="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" stroked="f">
               <v:path arrowok="t"/>
               <v:textbox>
                 <w:txbxContent>
@@ -1104,7 +1141,7 @@
                                   </pic:cNvPicPr>
                                 </pic:nvPicPr>
                                 <pic:blipFill>
-                                  <a:blip r:embed="rId4">
+                                  <a:blip r:embed="rId2">
                                     <a:extLst>
                                       <a:ext uri="{28A0092B-C50C-407E-A947-70E740481C1C}">
                                         <a14:useLocalDpi xmlns:a14="http://schemas.microsoft.com/office/drawing/2010/main" val="0"/>
@@ -1154,7 +1191,7 @@
 </file>
 
 <file path=word/footnotes.xml><?xml version="1.0" encoding="utf-8"?>
-<w:footnotes xmlns:wpc="http://schemas.microsoft.com/office/word/2010/wordprocessingCanvas" xmlns:cx="http://schemas.microsoft.com/office/drawing/2014/chartex" xmlns:cx1="http://schemas.microsoft.com/office/drawing/2015/9/8/chartex" xmlns:cx2="http://schemas.microsoft.com/office/drawing/2015/10/21/chartex" xmlns:cx3="http://schemas.microsoft.com/office/drawing/2016/5/9/chartex" xmlns:cx4="http://schemas.microsoft.com/office/drawing/2016/5/10/chartex" xmlns:cx5="http://schemas.microsoft.com/office/drawing/2016/5/11/chartex" xmlns:cx6="http://schemas.microsoft.com/office/drawing/2016/5/12/chartex" xmlns:cx7="http://schemas.microsoft.com/office/drawing/2016/5/13/chartex" xmlns:cx8="http://schemas.microsoft.com/office/drawing/2016/5/14/chartex" xmlns:mc="http://schemas.openxmlformats.org/markup-compatibility/2006" xmlns:aink="http://schemas.microsoft.com/office/drawing/2016/ink" xmlns:am3d="http://schemas.microsoft.com/office/drawing/2017/model3d" xmlns:o="urn:schemas-microsoft-com:office:office" xmlns:oel="http://schemas.microsoft.com/office/2019/extlst" xmlns:r="http://schemas.openxmlformats.org/officeDocument/2006/relationships" xmlns:m="http://schemas.openxmlformats.org/officeDocument/2006/math" xmlns:v="urn:schemas-microsoft-com:vml" xmlns:wp14="http://schemas.microsoft.com/office/word/2010/wordprocessingDrawing" xmlns:wp="http://schemas.openxmlformats.org/drawingml/2006/wordprocessingDrawing" xmlns:w10="urn:schemas-microsoft-com:office:word" xmlns:w="http://schemas.openxmlformats.org/wordprocessingml/2006/main" xmlns:w14="http://schemas.microsoft.com/office/word/2010/wordml" xmlns:w15="http://schemas.microsoft.com/office/word/2012/wordml" xmlns:w16cex="http://schemas.microsoft.com/office/word/2018/wordml/cex" xmlns:w16cid="http://schemas.microsoft.com/office/word/2016/wordml/cid" xmlns:w16="http://schemas.microsoft.com/office/word/2018/wordml" xmlns:w16sdtdh="http://schemas.microsoft.com/office/word/2020/wordml/sdtdatahash" xmlns:w16se="http://schemas.microsoft.com/office/word/2015/wordml/symex" xmlns:wpg="http://schemas.microsoft.com/office/word/2010/wordprocessingGroup" xmlns:wpi="http://schemas.microsoft.com/office/word/2010/wordprocessingInk" xmlns:wne="http://schemas.microsoft.com/office/word/2006/wordml" xmlns:wps="http://schemas.microsoft.com/office/word/2010/wordprocessingShape" mc:Ignorable="w14 w15 w16se w16cid w16 w16cex w16sdtdh wp14">
+<w:footnotes xmlns:wpc="http://schemas.microsoft.com/office/word/2010/wordprocessingCanvas" xmlns:cx="http://schemas.microsoft.com/office/drawing/2014/chartex" xmlns:cx1="http://schemas.microsoft.com/office/drawing/2015/9/8/chartex" xmlns:cx2="http://schemas.microsoft.com/office/drawing/2015/10/21/chartex" xmlns:cx3="http://schemas.microsoft.com/office/drawing/2016/5/9/chartex" xmlns:cx4="http://schemas.microsoft.com/office/drawing/2016/5/10/chartex" xmlns:cx5="http://schemas.microsoft.com/office/drawing/2016/5/11/chartex" xmlns:cx6="http://schemas.microsoft.com/office/drawing/2016/5/12/chartex" xmlns:cx7="http://schemas.microsoft.com/office/drawing/2016/5/13/chartex" xmlns:cx8="http://schemas.microsoft.com/office/drawing/2016/5/14/chartex" xmlns:mc="http://schemas.openxmlformats.org/markup-compatibility/2006" xmlns:aink="http://schemas.microsoft.com/office/drawing/2016/ink" xmlns:am3d="http://schemas.microsoft.com/office/drawing/2017/model3d" xmlns:o="urn:schemas-microsoft-com:office:office" xmlns:oel="http://schemas.microsoft.com/office/2019/extlst" xmlns:r="http://schemas.openxmlformats.org/officeDocument/2006/relationships" xmlns:m="http://schemas.openxmlformats.org/officeDocument/2006/math" xmlns:v="urn:schemas-microsoft-com:vml" xmlns:wp14="http://schemas.microsoft.com/office/word/2010/wordprocessingDrawing" xmlns:wp="http://schemas.openxmlformats.org/drawingml/2006/wordprocessingDrawing" xmlns:w10="urn:schemas-microsoft-com:office:word" xmlns:w="http://schemas.openxmlformats.org/wordprocessingml/2006/main" xmlns:w14="http://schemas.microsoft.com/office/word/2010/wordml" xmlns:w15="http://schemas.microsoft.com/office/word/2012/wordml" xmlns:w16cex="http://schemas.microsoft.com/office/word/2018/wordml/cex" xmlns:w16cid="http://schemas.microsoft.com/office/word/2016/wordml/cid" xmlns:w16="http://schemas.microsoft.com/office/word/2018/wordml" xmlns:w16du="http://schemas.microsoft.com/office/word/2023/wordml/word16du" xmlns:w16sdtdh="http://schemas.microsoft.com/office/word/2020/wordml/sdtdatahash" xmlns:w16sdtfl="http://schemas.microsoft.com/office/word/2024/wordml/sdtformatlock" xmlns:w16se="http://schemas.microsoft.com/office/word/2015/wordml/symex" xmlns:wpg="http://schemas.microsoft.com/office/word/2010/wordprocessingGroup" xmlns:wpi="http://schemas.microsoft.com/office/word/2010/wordprocessingInk" xmlns:wne="http://schemas.microsoft.com/office/word/2006/wordml" xmlns:wps="http://schemas.microsoft.com/office/word/2010/wordprocessingShape" mc:Ignorable="w14 w15 w16se w16cid w16 w16cex w16sdtdh w16sdtfl w16du wp14">
   <w:footnote w:type="separator" w:id="-1">
     <w:p>
       <w:r>
@@ -1173,17 +1210,247 @@
 </file>
 
 <file path=word/header1.xml><?xml version="1.0" encoding="utf-8"?>
-<w:hdr xmlns:wpc="http://schemas.microsoft.com/office/word/2010/wordprocessingCanvas" xmlns:cx="http://schemas.microsoft.com/office/drawing/2014/chartex" xmlns:cx1="http://schemas.microsoft.com/office/drawing/2015/9/8/chartex" xmlns:cx2="http://schemas.microsoft.com/office/drawing/2015/10/21/chartex" xmlns:cx3="http://schemas.microsoft.com/office/drawing/2016/5/9/chartex" xmlns:cx4="http://schemas.microsoft.com/office/drawing/2016/5/10/chartex" xmlns:cx5="http://schemas.microsoft.com/office/drawing/2016/5/11/chartex" xmlns:cx6="http://schemas.microsoft.com/office/drawing/2016/5/12/chartex" xmlns:cx7="http://schemas.microsoft.com/office/drawing/2016/5/13/chartex" xmlns:cx8="http://schemas.microsoft.com/office/drawing/2016/5/14/chartex" xmlns:mc="http://schemas.openxmlformats.org/markup-compatibility/2006" xmlns:aink="http://schemas.microsoft.com/office/drawing/2016/ink" xmlns:am3d="http://schemas.microsoft.com/office/drawing/2017/model3d" xmlns:o="urn:schemas-microsoft-com:office:office" xmlns:oel="http://schemas.microsoft.com/office/2019/extlst" xmlns:r="http://schemas.openxmlformats.org/officeDocument/2006/relationships" xmlns:m="http://schemas.openxmlformats.org/officeDocument/2006/math" xmlns:v="urn:schemas-microsoft-com:vml" xmlns:wp14="http://schemas.microsoft.com/office/word/2010/wordprocessingDrawing" xmlns:wp="http://schemas.openxmlformats.org/drawingml/2006/wordprocessingDrawing" xmlns:w10="urn:schemas-microsoft-com:office:word" xmlns:w="http://schemas.openxmlformats.org/wordprocessingml/2006/main" xmlns:w14="http://schemas.microsoft.com/office/word/2010/wordml" xmlns:w15="http://schemas.microsoft.com/office/word/2012/wordml" xmlns:w16cex="http://schemas.microsoft.com/office/word/2018/wordml/cex" xmlns:w16cid="http://schemas.microsoft.com/office/word/2016/wordml/cid" xmlns:w16="http://schemas.microsoft.com/office/word/2018/wordml" xmlns:w16sdtdh="http://schemas.microsoft.com/office/word/2020/wordml/sdtdatahash" xmlns:w16se="http://schemas.microsoft.com/office/word/2015/wordml/symex" xmlns:wpg="http://schemas.microsoft.com/office/word/2010/wordprocessingGroup" xmlns:wpi="http://schemas.microsoft.com/office/word/2010/wordprocessingInk" xmlns:wne="http://schemas.microsoft.com/office/word/2006/wordml" xmlns:wps="http://schemas.microsoft.com/office/word/2010/wordprocessingShape" mc:Ignorable="w14 w15 w16se w16cid w16 w16cex w16sdtdh wp14">
+<w:hdr xmlns:wpc="http://schemas.microsoft.com/office/word/2010/wordprocessingCanvas" xmlns:cx="http://schemas.microsoft.com/office/drawing/2014/chartex" xmlns:cx1="http://schemas.microsoft.com/office/drawing/2015/9/8/chartex" xmlns:cx2="http://schemas.microsoft.com/office/drawing/2015/10/21/chartex" xmlns:cx3="http://schemas.microsoft.com/office/drawing/2016/5/9/chartex" xmlns:cx4="http://schemas.microsoft.com/office/drawing/2016/5/10/chartex" xmlns:cx5="http://schemas.microsoft.com/office/drawing/2016/5/11/chartex" xmlns:cx6="http://schemas.microsoft.com/office/drawing/2016/5/12/chartex" xmlns:cx7="http://schemas.microsoft.com/office/drawing/2016/5/13/chartex" xmlns:cx8="http://schemas.microsoft.com/office/drawing/2016/5/14/chartex" xmlns:mc="http://schemas.openxmlformats.org/markup-compatibility/2006" xmlns:aink="http://schemas.microsoft.com/office/drawing/2016/ink" xmlns:am3d="http://schemas.microsoft.com/office/drawing/2017/model3d" xmlns:o="urn:schemas-microsoft-com:office:office" xmlns:oel="http://schemas.microsoft.com/office/2019/extlst" xmlns:r="http://schemas.openxmlformats.org/officeDocument/2006/relationships" xmlns:m="http://schemas.openxmlformats.org/officeDocument/2006/math" xmlns:v="urn:schemas-microsoft-com:vml" xmlns:wp14="http://schemas.microsoft.com/office/word/2010/wordprocessingDrawing" xmlns:wp="http://schemas.openxmlformats.org/drawingml/2006/wordprocessingDrawing" xmlns:w10="urn:schemas-microsoft-com:office:word" xmlns:w="http://schemas.openxmlformats.org/wordprocessingml/2006/main" xmlns:w14="http://schemas.microsoft.com/office/word/2010/wordml" xmlns:w15="http://schemas.microsoft.com/office/word/2012/wordml" xmlns:w16cex="http://schemas.microsoft.com/office/word/2018/wordml/cex" xmlns:w16cid="http://schemas.microsoft.com/office/word/2016/wordml/cid" xmlns:w16="http://schemas.microsoft.com/office/word/2018/wordml" xmlns:w16du="http://schemas.microsoft.com/office/word/2023/wordml/word16du" xmlns:w16sdtdh="http://schemas.microsoft.com/office/word/2020/wordml/sdtdatahash" xmlns:w16sdtfl="http://schemas.microsoft.com/office/word/2024/wordml/sdtformatlock" xmlns:w16se="http://schemas.microsoft.com/office/word/2015/wordml/symex" xmlns:wpg="http://schemas.microsoft.com/office/word/2010/wordprocessingGroup" xmlns:wpi="http://schemas.microsoft.com/office/word/2010/wordprocessingInk" xmlns:wne="http://schemas.microsoft.com/office/word/2006/wordml" xmlns:wps="http://schemas.microsoft.com/office/word/2010/wordprocessingShape" mc:Ignorable="w14 w15 w16se w16cid w16 w16cex w16sdtdh w16sdtfl w16du wp14">
   <w:p>
     <w:pPr>
       <w:pStyle w:val="Header"/>
     </w:pPr>
+    <w:r>
+      <w:rPr>
+        <w:noProof/>
+      </w:rPr>
+      <mc:AlternateContent>
+        <mc:Choice Requires="wps">
+          <w:drawing>
+            <wp:anchor distT="0" distB="0" distL="0" distR="0" simplePos="0" relativeHeight="251660288" behindDoc="0" locked="0" layoutInCell="1" allowOverlap="1" wp14:anchorId="59B7352A" wp14:editId="516D13DE">
+              <wp:simplePos x="635" y="635"/>
+              <wp:positionH relativeFrom="page">
+                <wp:align>right</wp:align>
+              </wp:positionH>
+              <wp:positionV relativeFrom="page">
+                <wp:align>top</wp:align>
+              </wp:positionV>
+              <wp:extent cx="1917700" cy="376555"/>
+              <wp:effectExtent l="0" t="0" r="0" b="4445"/>
+              <wp:wrapNone/>
+              <wp:docPr id="1660679603" name="Text Box 2" descr="Unclassified - Non-Classifié">
+                <a:extLst xmlns:a="http://schemas.openxmlformats.org/drawingml/2006/main">
+                  <a:ext uri="{5AE41FA2-C0FF-4470-9BD4-5FADCA87CBE2}">
+                    <aclsh:classification xmlns:aclsh="http://schemas.microsoft.com/office/drawing/2020/classificationShape" classificationOutcomeType="hdr"/>
+                  </a:ext>
+                </a:extLst>
+              </wp:docPr>
+              <wp:cNvGraphicFramePr/>
+              <a:graphic xmlns:a="http://schemas.openxmlformats.org/drawingml/2006/main">
+                <a:graphicData uri="http://schemas.microsoft.com/office/word/2010/wordprocessingShape">
+                  <wps:wsp>
+                    <wps:cNvSpPr txBox="1"/>
+                    <wps:spPr>
+                      <a:xfrm>
+                        <a:off x="0" y="0"/>
+                        <a:ext cx="1917700" cy="376555"/>
+                      </a:xfrm>
+                      <a:prstGeom prst="rect">
+                        <a:avLst/>
+                      </a:prstGeom>
+                      <a:noFill/>
+                      <a:ln>
+                        <a:noFill/>
+                      </a:ln>
+                    </wps:spPr>
+                    <wps:txbx>
+                      <w:txbxContent>
+                        <w:p>
+                          <w:pPr>
+                            <w:rPr>
+                              <w:rFonts w:ascii="Calibri" w:eastAsia="Calibri" w:hAnsi="Calibri" w:cs="Calibri"/>
+                              <w:noProof/>
+                              <w:color w:val="000000"/>
+                            </w:rPr>
+                          </w:pPr>
+                          <w:r>
+                            <w:rPr>
+                              <w:rFonts w:ascii="Calibri" w:eastAsia="Calibri" w:hAnsi="Calibri" w:cs="Calibri"/>
+                              <w:noProof/>
+                              <w:color w:val="000000"/>
+                            </w:rPr>
+                            <w:t>Unclassified - Non-Classifié</w:t>
+                          </w:r>
+                        </w:p>
+                      </w:txbxContent>
+                    </wps:txbx>
+                    <wps:bodyPr rot="0" spcFirstLastPara="0" vertOverflow="overflow" horzOverflow="overflow" vert="horz" wrap="none" lIns="0" tIns="190500" rIns="254000" bIns="0" numCol="1" spcCol="0" rtlCol="0" fromWordArt="0" anchor="t" anchorCtr="0" forceAA="0" compatLnSpc="1">
+                      <a:prstTxWarp prst="textNoShape">
+                        <a:avLst/>
+                      </a:prstTxWarp>
+                      <a:spAutoFit/>
+                    </wps:bodyPr>
+                  </wps:wsp>
+                </a:graphicData>
+              </a:graphic>
+            </wp:anchor>
+          </w:drawing>
+        </mc:Choice>
+        <mc:Fallback>
+          <w:pict>
+            <v:shapetype w14:anchorId="59B7352A" id="_x0000_t202" coordsize="21600,21600" o:spt="202" path="m,l,21600r21600,l21600,xe">
+              <v:stroke joinstyle="miter"/>
+              <v:path gradientshapeok="t" o:connecttype="rect"/>
+            </v:shapetype>
+            <v:shape id="Text Box 2" o:spid="_x0000_s1026" type="#_x0000_t202" alt="Unclassified - Non-Classifié" style="position:absolute;margin-left:111pt;margin-top:0;width:151pt;height:29.65pt;z-index:251660288;visibility:visible;mso-wrap-style:none;mso-wrap-distance-left:0;mso-wrap-distance-top:0;mso-wrap-distance-right:0;mso-wrap-distance-bottom:0;mso-position-horizontal:right;mso-position-horizontal-relative:page;mso-position-vertical:top;mso-position-vertical-relative:page;v-text-anchor:top" o:gfxdata="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" filled="f" stroked="f">
+              <v:textbox style="mso-fit-shape-to-text:t" inset="0,15pt,20pt,0">
+                <w:txbxContent>
+                  <w:p>
+                    <w:pPr>
+                      <w:rPr>
+                        <w:rFonts w:ascii="Calibri" w:eastAsia="Calibri" w:hAnsi="Calibri" w:cs="Calibri"/>
+                        <w:noProof/>
+                        <w:color w:val="000000"/>
+                      </w:rPr>
+                    </w:pPr>
+                    <w:r>
+                      <w:rPr>
+                        <w:rFonts w:ascii="Calibri" w:eastAsia="Calibri" w:hAnsi="Calibri" w:cs="Calibri"/>
+                        <w:noProof/>
+                        <w:color w:val="000000"/>
+                      </w:rPr>
+                      <w:t>Unclassified - Non-Classifié</w:t>
+                    </w:r>
+                  </w:p>
+                </w:txbxContent>
+              </v:textbox>
+              <w10:wrap anchorx="page" anchory="page"/>
+            </v:shape>
+          </w:pict>
+        </mc:Fallback>
+      </mc:AlternateContent>
+    </w:r>
+  </w:p>
+</w:hdr>
+</file>
+
+<file path=word/header2.xml><?xml version="1.0" encoding="utf-8"?>
+<w:hdr xmlns:wpc="http://schemas.microsoft.com/office/word/2010/wordprocessingCanvas" xmlns:cx="http://schemas.microsoft.com/office/drawing/2014/chartex" xmlns:cx1="http://schemas.microsoft.com/office/drawing/2015/9/8/chartex" xmlns:cx2="http://schemas.microsoft.com/office/drawing/2015/10/21/chartex" xmlns:cx3="http://schemas.microsoft.com/office/drawing/2016/5/9/chartex" xmlns:cx4="http://schemas.microsoft.com/office/drawing/2016/5/10/chartex" xmlns:cx5="http://schemas.microsoft.com/office/drawing/2016/5/11/chartex" xmlns:cx6="http://schemas.microsoft.com/office/drawing/2016/5/12/chartex" xmlns:cx7="http://schemas.microsoft.com/office/drawing/2016/5/13/chartex" xmlns:cx8="http://schemas.microsoft.com/office/drawing/2016/5/14/chartex" xmlns:mc="http://schemas.openxmlformats.org/markup-compatibility/2006" xmlns:aink="http://schemas.microsoft.com/office/drawing/2016/ink" xmlns:am3d="http://schemas.microsoft.com/office/drawing/2017/model3d" xmlns:o="urn:schemas-microsoft-com:office:office" xmlns:oel="http://schemas.microsoft.com/office/2019/extlst" xmlns:r="http://schemas.openxmlformats.org/officeDocument/2006/relationships" xmlns:m="http://schemas.openxmlformats.org/officeDocument/2006/math" xmlns:v="urn:schemas-microsoft-com:vml" xmlns:wp14="http://schemas.microsoft.com/office/word/2010/wordprocessingDrawing" xmlns:wp="http://schemas.openxmlformats.org/drawingml/2006/wordprocessingDrawing" xmlns:w10="urn:schemas-microsoft-com:office:word" xmlns:w="http://schemas.openxmlformats.org/wordprocessingml/2006/main" xmlns:w14="http://schemas.microsoft.com/office/word/2010/wordml" xmlns:w15="http://schemas.microsoft.com/office/word/2012/wordml" xmlns:w16cex="http://schemas.microsoft.com/office/word/2018/wordml/cex" xmlns:w16cid="http://schemas.microsoft.com/office/word/2016/wordml/cid" xmlns:w16="http://schemas.microsoft.com/office/word/2018/wordml" xmlns:w16du="http://schemas.microsoft.com/office/word/2023/wordml/word16du" xmlns:w16sdtdh="http://schemas.microsoft.com/office/word/2020/wordml/sdtdatahash" xmlns:w16sdtfl="http://schemas.microsoft.com/office/word/2024/wordml/sdtformatlock" xmlns:w16se="http://schemas.microsoft.com/office/word/2015/wordml/symex" xmlns:wpg="http://schemas.microsoft.com/office/word/2010/wordprocessingGroup" xmlns:wpi="http://schemas.microsoft.com/office/word/2010/wordprocessingInk" xmlns:wne="http://schemas.microsoft.com/office/word/2006/wordml" xmlns:wps="http://schemas.microsoft.com/office/word/2010/wordprocessingShape" mc:Ignorable="w14 w15 w16se w16cid w16 w16cex w16sdtdh w16sdtfl w16du wp14">
+  <w:p>
+    <w:pPr>
+      <w:pStyle w:val="Header"/>
+    </w:pPr>
+    <w:r>
+      <w:rPr>
+        <w:noProof/>
+      </w:rPr>
+      <mc:AlternateContent>
+        <mc:Choice Requires="wps">
+          <w:drawing>
+            <wp:anchor distT="0" distB="0" distL="0" distR="0" simplePos="0" relativeHeight="251659264" behindDoc="0" locked="0" layoutInCell="1" allowOverlap="1" wp14:anchorId="384E1311" wp14:editId="63CA1B33">
+              <wp:simplePos x="635" y="635"/>
+              <wp:positionH relativeFrom="page">
+                <wp:align>right</wp:align>
+              </wp:positionH>
+              <wp:positionV relativeFrom="page">
+                <wp:align>top</wp:align>
+              </wp:positionV>
+              <wp:extent cx="1917700" cy="376555"/>
+              <wp:effectExtent l="0" t="0" r="0" b="4445"/>
+              <wp:wrapNone/>
+              <wp:docPr id="897393018" name="Text Box 1" descr="Unclassified - Non-Classifié">
+                <a:extLst xmlns:a="http://schemas.openxmlformats.org/drawingml/2006/main">
+                  <a:ext uri="{5AE41FA2-C0FF-4470-9BD4-5FADCA87CBE2}">
+                    <aclsh:classification xmlns:aclsh="http://schemas.microsoft.com/office/drawing/2020/classificationShape" classificationOutcomeType="hdr"/>
+                  </a:ext>
+                </a:extLst>
+              </wp:docPr>
+              <wp:cNvGraphicFramePr/>
+              <a:graphic xmlns:a="http://schemas.openxmlformats.org/drawingml/2006/main">
+                <a:graphicData uri="http://schemas.microsoft.com/office/word/2010/wordprocessingShape">
+                  <wps:wsp>
+                    <wps:cNvSpPr txBox="1"/>
+                    <wps:spPr>
+                      <a:xfrm>
+                        <a:off x="0" y="0"/>
+                        <a:ext cx="1917700" cy="376555"/>
+                      </a:xfrm>
+                      <a:prstGeom prst="rect">
+                        <a:avLst/>
+                      </a:prstGeom>
+                      <a:noFill/>
+                      <a:ln>
+                        <a:noFill/>
+                      </a:ln>
+                    </wps:spPr>
+                    <wps:txbx>
+                      <w:txbxContent>
+                        <w:p>
+                          <w:pPr>
+                            <w:rPr>
+                              <w:rFonts w:ascii="Calibri" w:eastAsia="Calibri" w:hAnsi="Calibri" w:cs="Calibri"/>
+                              <w:noProof/>
+                              <w:color w:val="000000"/>
+                            </w:rPr>
+                          </w:pPr>
+                          <w:r>
+                            <w:rPr>
+                              <w:rFonts w:ascii="Calibri" w:eastAsia="Calibri" w:hAnsi="Calibri" w:cs="Calibri"/>
+                              <w:noProof/>
+                              <w:color w:val="000000"/>
+                            </w:rPr>
+                            <w:t>Unclassified - Non-Classifié</w:t>
+                          </w:r>
+                        </w:p>
+                      </w:txbxContent>
+                    </wps:txbx>
+                    <wps:bodyPr rot="0" spcFirstLastPara="0" vertOverflow="overflow" horzOverflow="overflow" vert="horz" wrap="none" lIns="0" tIns="190500" rIns="254000" bIns="0" numCol="1" spcCol="0" rtlCol="0" fromWordArt="0" anchor="t" anchorCtr="0" forceAA="0" compatLnSpc="1">
+                      <a:prstTxWarp prst="textNoShape">
+                        <a:avLst/>
+                      </a:prstTxWarp>
+                      <a:spAutoFit/>
+                    </wps:bodyPr>
+                  </wps:wsp>
+                </a:graphicData>
+              </a:graphic>
+            </wp:anchor>
+          </w:drawing>
+        </mc:Choice>
+        <mc:Fallback>
+          <w:pict>
+            <v:shapetype w14:anchorId="384E1311" id="_x0000_t202" coordsize="21600,21600" o:spt="202" path="m,l,21600r21600,l21600,xe">
+              <v:stroke joinstyle="miter"/>
+              <v:path gradientshapeok="t" o:connecttype="rect"/>
+            </v:shapetype>
+            <v:shape id="Text Box 1" o:spid="_x0000_s1029" type="#_x0000_t202" alt="Unclassified - Non-Classifié" style="position:absolute;margin-left:111pt;margin-top:0;width:151pt;height:29.65pt;z-index:251659264;visibility:visible;mso-wrap-style:none;mso-wrap-distance-left:0;mso-wrap-distance-top:0;mso-wrap-distance-right:0;mso-wrap-distance-bottom:0;mso-position-horizontal:right;mso-position-horizontal-relative:page;mso-position-vertical:top;mso-position-vertical-relative:page;v-text-anchor:top" o:gfxdata="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" filled="f" stroked="f">
+              <v:textbox style="mso-fit-shape-to-text:t" inset="0,15pt,20pt,0">
+                <w:txbxContent>
+                  <w:p>
+                    <w:pPr>
+                      <w:rPr>
+                        <w:rFonts w:ascii="Calibri" w:eastAsia="Calibri" w:hAnsi="Calibri" w:cs="Calibri"/>
+                        <w:noProof/>
+                        <w:color w:val="000000"/>
+                      </w:rPr>
+                    </w:pPr>
+                    <w:r>
+                      <w:rPr>
+                        <w:rFonts w:ascii="Calibri" w:eastAsia="Calibri" w:hAnsi="Calibri" w:cs="Calibri"/>
+                        <w:noProof/>
+                        <w:color w:val="000000"/>
+                      </w:rPr>
+                      <w:t>Unclassified - Non-Classifié</w:t>
+                    </w:r>
+                  </w:p>
+                </w:txbxContent>
+              </v:textbox>
+              <w10:wrap anchorx="page" anchory="page"/>
+            </v:shape>
+          </w:pict>
+        </mc:Fallback>
+      </mc:AlternateContent>
+    </w:r>
   </w:p>
 </w:hdr>
 </file>
 
 <file path=word/numbering.xml><?xml version="1.0" encoding="utf-8"?>
-<w:numbering xmlns:wpc="http://schemas.microsoft.com/office/word/2010/wordprocessingCanvas" xmlns:cx="http://schemas.microsoft.com/office/drawing/2014/chartex" xmlns:cx1="http://schemas.microsoft.com/office/drawing/2015/9/8/chartex" xmlns:cx2="http://schemas.microsoft.com/office/drawing/2015/10/21/chartex" xmlns:cx3="http://schemas.microsoft.com/office/drawing/2016/5/9/chartex" xmlns:cx4="http://schemas.microsoft.com/office/drawing/2016/5/10/chartex" xmlns:cx5="http://schemas.microsoft.com/office/drawing/2016/5/11/chartex" xmlns:cx6="http://schemas.microsoft.com/office/drawing/2016/5/12/chartex" xmlns:cx7="http://schemas.microsoft.com/office/drawing/2016/5/13/chartex" xmlns:cx8="http://schemas.microsoft.com/office/drawing/2016/5/14/chartex" xmlns:mc="http://schemas.openxmlformats.org/markup-compatibility/2006" xmlns:aink="http://schemas.microsoft.com/office/drawing/2016/ink" xmlns:am3d="http://schemas.microsoft.com/office/drawing/2017/model3d" xmlns:o="urn:schemas-microsoft-com:office:office" xmlns:oel="http://schemas.microsoft.com/office/2019/extlst" xmlns:r="http://schemas.openxmlformats.org/officeDocument/2006/relationships" xmlns:m="http://schemas.openxmlformats.org/officeDocument/2006/math" xmlns:v="urn:schemas-microsoft-com:vml" xmlns:wp14="http://schemas.microsoft.com/office/word/2010/wordprocessingDrawing" xmlns:wp="http://schemas.openxmlformats.org/drawingml/2006/wordprocessingDrawing" xmlns:w10="urn:schemas-microsoft-com:office:word" xmlns:w="http://schemas.openxmlformats.org/wordprocessingml/2006/main" xmlns:w14="http://schemas.microsoft.com/office/word/2010/wordml" xmlns:w15="http://schemas.microsoft.com/office/word/2012/wordml" xmlns:w16cex="http://schemas.microsoft.com/office/word/2018/wordml/cex" xmlns:w16cid="http://schemas.microsoft.com/office/word/2016/wordml/cid" xmlns:w16="http://schemas.microsoft.com/office/word/2018/wordml" xmlns:w16sdtdh="http://schemas.microsoft.com/office/word/2020/wordml/sdtdatahash" xmlns:w16se="http://schemas.microsoft.com/office/word/2015/wordml/symex" xmlns:wpg="http://schemas.microsoft.com/office/word/2010/wordprocessingGroup" xmlns:wpi="http://schemas.microsoft.com/office/word/2010/wordprocessingInk" xmlns:wne="http://schemas.microsoft.com/office/word/2006/wordml" xmlns:wps="http://schemas.microsoft.com/office/word/2010/wordprocessingShape" mc:Ignorable="w14 w15 w16se w16cid w16 w16cex w16sdtdh wp14">
+<w:numbering xmlns:wpc="http://schemas.microsoft.com/office/word/2010/wordprocessingCanvas" xmlns:cx="http://schemas.microsoft.com/office/drawing/2014/chartex" xmlns:cx1="http://schemas.microsoft.com/office/drawing/2015/9/8/chartex" xmlns:cx2="http://schemas.microsoft.com/office/drawing/2015/10/21/chartex" xmlns:cx3="http://schemas.microsoft.com/office/drawing/2016/5/9/chartex" xmlns:cx4="http://schemas.microsoft.com/office/drawing/2016/5/10/chartex" xmlns:cx5="http://schemas.microsoft.com/office/drawing/2016/5/11/chartex" xmlns:cx6="http://schemas.microsoft.com/office/drawing/2016/5/12/chartex" xmlns:cx7="http://schemas.microsoft.com/office/drawing/2016/5/13/chartex" xmlns:cx8="http://schemas.microsoft.com/office/drawing/2016/5/14/chartex" xmlns:mc="http://schemas.openxmlformats.org/markup-compatibility/2006" xmlns:aink="http://schemas.microsoft.com/office/drawing/2016/ink" xmlns:am3d="http://schemas.microsoft.com/office/drawing/2017/model3d" xmlns:o="urn:schemas-microsoft-com:office:office" xmlns:oel="http://schemas.microsoft.com/office/2019/extlst" xmlns:r="http://schemas.openxmlformats.org/officeDocument/2006/relationships" xmlns:m="http://schemas.openxmlformats.org/officeDocument/2006/math" xmlns:v="urn:schemas-microsoft-com:vml" xmlns:wp14="http://schemas.microsoft.com/office/word/2010/wordprocessingDrawing" xmlns:wp="http://schemas.openxmlformats.org/drawingml/2006/wordprocessingDrawing" xmlns:w10="urn:schemas-microsoft-com:office:word" xmlns:w="http://schemas.openxmlformats.org/wordprocessingml/2006/main" xmlns:w14="http://schemas.microsoft.com/office/word/2010/wordml" xmlns:w15="http://schemas.microsoft.com/office/word/2012/wordml" xmlns:w16cex="http://schemas.microsoft.com/office/word/2018/wordml/cex" xmlns:w16cid="http://schemas.microsoft.com/office/word/2016/wordml/cid" xmlns:w16="http://schemas.microsoft.com/office/word/2018/wordml" xmlns:w16du="http://schemas.microsoft.com/office/word/2023/wordml/word16du" xmlns:w16sdtdh="http://schemas.microsoft.com/office/word/2020/wordml/sdtdatahash" xmlns:w16sdtfl="http://schemas.microsoft.com/office/word/2024/wordml/sdtformatlock" xmlns:w16se="http://schemas.microsoft.com/office/word/2015/wordml/symex" xmlns:wpg="http://schemas.microsoft.com/office/word/2010/wordprocessingGroup" xmlns:wpi="http://schemas.microsoft.com/office/word/2010/wordprocessingInk" xmlns:wne="http://schemas.microsoft.com/office/word/2006/wordml" xmlns:wps="http://schemas.microsoft.com/office/word/2010/wordprocessingShape" mc:Ignorable="w14 w15 w16se w16cid w16 w16cex w16sdtdh w16sdtfl w16du wp14">
   <w:abstractNum w:abstractNumId="0" w15:restartNumberingAfterBreak="0">
     <w:nsid w:val="3E2C6671"/>
     <w:multiLevelType w:val="hybridMultilevel"/>
@@ -1304,7 +1571,7 @@
 </file>
 
 <file path=word/styles.xml><?xml version="1.0" encoding="utf-8"?>
-<w:styles xmlns:mc="http://schemas.openxmlformats.org/markup-compatibility/2006" xmlns:r="http://schemas.openxmlformats.org/officeDocument/2006/relationships" xmlns:w="http://schemas.openxmlformats.org/wordprocessingml/2006/main" xmlns:w14="http://schemas.microsoft.com/office/word/2010/wordml" xmlns:w15="http://schemas.microsoft.com/office/word/2012/wordml" xmlns:w16cex="http://schemas.microsoft.com/office/word/2018/wordml/cex" xmlns:w16cid="http://schemas.microsoft.com/office/word/2016/wordml/cid" xmlns:w16="http://schemas.microsoft.com/office/word/2018/wordml" xmlns:w16sdtdh="http://schemas.microsoft.com/office/word/2020/wordml/sdtdatahash" xmlns:w16se="http://schemas.microsoft.com/office/word/2015/wordml/symex" mc:Ignorable="w14 w15 w16se w16cid w16 w16cex w16sdtdh">
+<w:styles xmlns:mc="http://schemas.openxmlformats.org/markup-compatibility/2006" xmlns:r="http://schemas.openxmlformats.org/officeDocument/2006/relationships" xmlns:w="http://schemas.openxmlformats.org/wordprocessingml/2006/main" xmlns:w14="http://schemas.microsoft.com/office/word/2010/wordml" xmlns:w15="http://schemas.microsoft.com/office/word/2012/wordml" xmlns:w16cex="http://schemas.microsoft.com/office/word/2018/wordml/cex" xmlns:w16cid="http://schemas.microsoft.com/office/word/2016/wordml/cid" xmlns:w16="http://schemas.microsoft.com/office/word/2018/wordml" xmlns:w16du="http://schemas.microsoft.com/office/word/2023/wordml/word16du" xmlns:w16sdtdh="http://schemas.microsoft.com/office/word/2020/wordml/sdtdatahash" xmlns:w16sdtfl="http://schemas.microsoft.com/office/word/2024/wordml/sdtformatlock" xmlns:w16se="http://schemas.microsoft.com/office/word/2015/wordml/symex" mc:Ignorable="w14 w15 w16se w16cid w16 w16cex w16sdtdh w16sdtfl w16du">
   <w:docDefaults>
     <w:rPrDefault>
       <w:rPr>

</xml_diff>